<commit_message>
docs: Add Jira board evidence and polish week 3 documents
</commit_message>
<xml_diff>
--- a/docs/Plan de pruebas v1 — PrestaShop.docx
+++ b/docs/Plan de pruebas v1 — PrestaShop.docx
@@ -93,7 +93,7 @@
                 <w:sz w:val="20"/>
                 <w:szCs w:val="20"/>
               </w:rPr>
-              <w:t xml:space="preserve"> Dice qué se prueba en la demo de PrestaShop y qué no, cómo, con qué entorno, quién, cuándo y cuándo se da por terminado. Se basa en el Documento de Alcance de Calidad (QA-ALC-001, v1.1). Lo que todavía no se sabe queda como «por completar».</w:t>
+              <w:t xml:space="preserve"> Plan de las pruebas manuales del Módulo 1 sobre la demo de PrestaShop. Parte del Documento de Alcance de Calidad (QA-ALC-001, v1.1) y suma lo aprendido en la semana 2. Lo que aún no está definido queda como «por completar».</w:t>
             </w:r>
           </w:p>
         </w:tc>
@@ -505,7 +505,7 @@
       </w:r>
       <w:r>
         <w:rPr/>
-        <w:t xml:space="preserve"> verificar que un cliente pueda crear una cuenta o iniciar sesión, encontrar un producto, agregarlo al carrito y completar la compra sin errores y con totales correctos; que el flujo de compra sea usable con teclado y lector de pantalla; y que un empleado pueda ver ese pedido en el back office.</w:t>
+        <w:t xml:space="preserve"> comprobar que un cliente pueda comprar de principio a fin (cuenta, búsqueda, carrito y checkout) sin errores y con el total correcto, y que ese flujo se pueda usar con teclado y lector de pantalla. Después, que el pedido aparezca en el back office.</w:t>
       </w:r>
     </w:p>
     <w:tbl>

</xml_diff>